<commit_message>
upd: add anya name
</commit_message>
<xml_diff>
--- a/report.docx
+++ b/report.docx
@@ -330,7 +330,19 @@
         <w:rPr>
           <w:lang w:val="ru-RU"/>
         </w:rPr>
-        <w:t xml:space="preserve">                                                    </w:t>
+        <w:t xml:space="preserve">                                                   </w:t>
+      </w:r>
+      <w:r>
+        <w:rPr>
+          <w:lang w:val="ru-RU"/>
+        </w:rPr>
+        <w:t xml:space="preserve">    </w:t>
+      </w:r>
+      <w:r>
+        <w:rPr>
+          <w:lang w:val="ru-RU"/>
+        </w:rPr>
+        <w:t xml:space="preserve"> </w:t>
       </w:r>
       <w:r>
         <w:rPr>
@@ -342,16 +354,20 @@
         <w:rPr>
           <w:lang w:val="ru-RU"/>
         </w:rPr>
-        <w:t xml:space="preserve"> Моисеева </w:t>
-      </w:r>
-      <w:proofErr w:type="gramStart"/>
-      <w:r>
-        <w:rPr>
-          <w:lang w:val="ru-RU"/>
-        </w:rPr>
-        <w:t>А..</w:t>
-      </w:r>
-      <w:proofErr w:type="gramEnd"/>
+        <w:t xml:space="preserve"> Моисеева А.</w:t>
+      </w:r>
+      <w:r>
+        <w:rPr>
+          <w:lang w:val="ru-RU"/>
+        </w:rPr>
+        <w:t>Е</w:t>
+      </w:r>
+      <w:r>
+        <w:rPr>
+          <w:lang w:val="ru-RU"/>
+        </w:rPr>
+        <w:t>.</w:t>
+      </w:r>
     </w:p>
     <w:p>
       <w:pPr>
@@ -567,16 +583,20 @@
         <w:rPr>
           <w:lang w:val="ru-RU"/>
         </w:rPr>
-        <w:t xml:space="preserve">Моисеева </w:t>
-      </w:r>
-      <w:proofErr w:type="gramStart"/>
-      <w:r>
-        <w:rPr>
-          <w:lang w:val="ru-RU"/>
-        </w:rPr>
-        <w:t>А..</w:t>
-      </w:r>
-      <w:proofErr w:type="gramEnd"/>
+        <w:t>Моисеева А.</w:t>
+      </w:r>
+      <w:r>
+        <w:rPr>
+          <w:lang w:val="ru-RU"/>
+        </w:rPr>
+        <w:t>Е</w:t>
+      </w:r>
+      <w:r>
+        <w:rPr>
+          <w:lang w:val="ru-RU"/>
+        </w:rPr>
+        <w:t>.</w:t>
+      </w:r>
     </w:p>
     <w:p>
       <w:pPr>
@@ -633,7 +653,6 @@
       </w:pPr>
       <w:r>
         <w:rPr>
-          <w:b/>
           <w:bCs/>
           <w:lang w:val="ru-RU"/>
         </w:rPr>
@@ -1010,7 +1029,31 @@
         <w:rPr>
           <w:lang w:val="ru-RU"/>
         </w:rPr>
-        <w:t xml:space="preserve">                                                    </w:t>
+        <w:t xml:space="preserve">                                              </w:t>
+      </w:r>
+      <w:r>
+        <w:rPr>
+          <w:lang w:val="ru-RU"/>
+        </w:rPr>
+        <w:t xml:space="preserve">  </w:t>
+      </w:r>
+      <w:r>
+        <w:rPr>
+          <w:lang w:val="ru-RU"/>
+        </w:rPr>
+        <w:t xml:space="preserve">    </w:t>
+      </w:r>
+      <w:r>
+        <w:rPr>
+          <w:lang w:val="ru-RU"/>
+        </w:rPr>
+        <w:t xml:space="preserve">  </w:t>
+      </w:r>
+      <w:r>
+        <w:rPr>
+          <w:lang w:val="ru-RU"/>
+        </w:rPr>
+        <w:t xml:space="preserve">  </w:t>
       </w:r>
       <w:r>
         <w:rPr>
@@ -1022,16 +1065,20 @@
         <w:rPr>
           <w:lang w:val="ru-RU"/>
         </w:rPr>
-        <w:t xml:space="preserve"> Моисеева </w:t>
-      </w:r>
-      <w:proofErr w:type="gramStart"/>
-      <w:r>
-        <w:rPr>
-          <w:lang w:val="ru-RU"/>
-        </w:rPr>
-        <w:t>А..</w:t>
-      </w:r>
-      <w:proofErr w:type="gramEnd"/>
+        <w:t xml:space="preserve"> Моисеева А.</w:t>
+      </w:r>
+      <w:r>
+        <w:rPr>
+          <w:lang w:val="ru-RU"/>
+        </w:rPr>
+        <w:t>Е</w:t>
+      </w:r>
+      <w:r>
+        <w:rPr>
+          <w:lang w:val="ru-RU"/>
+        </w:rPr>
+        <w:t>.</w:t>
+      </w:r>
     </w:p>
     <w:p>
       <w:pPr>
@@ -1143,6 +1190,8 @@
           <w:lang w:val="ru-RU"/>
         </w:rPr>
       </w:pPr>
+      <w:bookmarkStart w:id="0" w:name="_GoBack"/>
+      <w:bookmarkEnd w:id="0"/>
     </w:p>
     <w:p>
       <w:pPr>
@@ -14067,15 +14116,7 @@
         <w:rPr>
           <w:lang w:val="ru-RU"/>
         </w:rPr>
-        <w:t>-операций с растущей стоимостью при увеличении глубины о</w:t>
-      </w:r>
-      <w:bookmarkStart w:id="0" w:name="_GoBack"/>
-      <w:bookmarkEnd w:id="0"/>
-      <w:r>
-        <w:rPr>
-          <w:lang w:val="ru-RU"/>
-        </w:rPr>
-        <w:t xml:space="preserve">бхода. Запросы на языке </w:t>
+        <w:t xml:space="preserve">-операций с растущей стоимостью при увеличении глубины обхода. Запросы на языке </w:t>
       </w:r>
       <w:r>
         <w:t>Cypher</w:t>
@@ -17888,7 +17929,7 @@
         <w:sz w:val="24"/>
         <w:szCs w:val="24"/>
       </w:rPr>
-      <w:t>25</w:t>
+      <w:t>2</w:t>
     </w:r>
     <w:r>
       <w:rPr>

</xml_diff>